<commit_message>
Rewrite director Q&A in plain Indian English + fix India pricing framing
- All 56 answers simplified to fresher-friendly plain English; jargon
  explained inline (caching, RAG, hashing, fail-closed)
- Q29: reframed "why not hire devs" from US-salary comparison to
  margin/bill-rate ("one Iris dev bills like three")
- Q31 + Q1/Q3: money shown in INR (with USD), plus a note that USD
  pricing targets overseas buyers and the value to Iris is margin
- Updated platform test count to 550+

Co-Authored-By: Claude Opus 4.8 (1M context) <noreply@anthropic.com>
</commit_message>
<xml_diff>
--- a/demo-assets/director-demo-qa.docx
+++ b/demo-assets/director-demo-qa.docx
@@ -23,7 +23,7 @@
           <w:sz w:val="24"/>
           <w:szCs w:val="24"/>
         </w:rPr>
-        <w:t xml:space="preserve">Every question they're likely to ask + a tight, honest answer.</w:t>
+        <w:t xml:space="preserve">Every question your director may ask — with a short, simple, honest answer.</w:t>
       </w:r>
     </w:p>
     <w:p>
@@ -36,7 +36,7 @@
           <w:sz w:val="20"/>
           <w:szCs w:val="20"/>
         </w:rPr>
-        <w:t xml:space="preserve">AI Multi-Agent Scrum Team Platform   |   Updated June 11, 2026</w:t>
+        <w:t xml:space="preserve">AI Multi-Agent Scrum Team Platform   |   Updated June 11, 2026   |   Plain-English edition</w:t>
       </w:r>
     </w:p>
     <w:p>
@@ -88,7 +88,7 @@
         <w:ind w:left="240"/>
       </w:pPr>
       <w:r>
-        <w:t xml:space="preserve">Yes. After the recent optimization sprint, one sprint costs about $0.40 in AI fees, down from $4.50. That's a 90% cost reduction. For a client running 100 sprints a month, the AI bill drops from $450 to $40.</w:t>
+        <w:t xml:space="preserve">Yes. Earlier, one sprint (one batch of work) cost about Rs 380 in AI charges. After our cost-saving work, it costs about Rs 34 — a 90% drop. So if a client runs 100 such batches a month, the AI bill falls from about Rs 38,000 to about Rs 3,400.</w:t>
       </w:r>
     </w:p>
     <w:p>
@@ -122,7 +122,7 @@
         <w:ind w:left="240"/>
       </w:pPr>
       <w:r>
-        <w:t xml:space="preserve">Three changes: (1) Prompt caching — AI remembers repeated instructions instead of paying full price every call. (2) Static tools (linters) handle rule-checking that doesn't need AI. (3) The PRD agent fills a structured form instead of writing free-form JSON every time. All three are live, tested with 190 unit tests passing.</w:t>
+        <w:t xml:space="preserve">Three simple changes. (1) The AI now remembers repeated instructions instead of paying full price to re-read them every time — this is called caching. (2) Simple rule-checking tools do the boring checks, so we don't spend AI money on them. (3) One agent fills a ready-made form instead of writing everything from scratch each time. All three are live and tested.</w:t>
       </w:r>
     </w:p>
     <w:p>
@@ -147,16 +147,16 @@
           <w:sz w:val="26"/>
           <w:szCs w:val="26"/>
         </w:rPr>
-        <w:t xml:space="preserve">What's the actual cost per developer per month?</w:t>
-      </w:r>
-    </w:p>
-    <w:p>
-      <w:pPr>
-        <w:spacing w:after="120"/>
-        <w:ind w:left="240"/>
-      </w:pPr>
-      <w:r>
-        <w:t xml:space="preserve">At Professional tier ($8,000/month), it covers 15 stories per sprint, 2 sprints per month = 30 stories. That's roughly $267 per delivered story — significantly cheaper than a contractor at $150/hour delivering the same story.</w:t>
+        <w:t xml:space="preserve">What is the actual cost per developer per month?</w:t>
+      </w:r>
+    </w:p>
+    <w:p>
+      <w:pPr>
+        <w:spacing w:after="120"/>
+        <w:ind w:left="240"/>
+      </w:pPr>
+      <w:r>
+        <w:t xml:space="preserve">On the Professional plan (about Rs 6.7 lakh/month) you get 15 stories per sprint, 2 sprints a month — so about 30 finished stories. That comes to roughly Rs 22,000 per finished story, and it already includes testing, security review, and documentation.</w:t>
       </w:r>
     </w:p>
     <w:p>
@@ -190,7 +190,7 @@
         <w:ind w:left="240"/>
       </w:pPr>
       <w:r>
-        <w:t xml:space="preserve">~70% infrastructure (compute, database, queue) and ~30% AI tokens after the optimization. Pre-optimization it was 50/50.</w:t>
+        <w:t xml:space="preserve">About 70% goes to running the servers, database, and queue, and about 30% to the AI itself (after our savings). Before the savings work, it was a 50-50 split.</w:t>
       </w:r>
     </w:p>
     <w:p>
@@ -224,7 +224,7 @@
         <w:ind w:left="240"/>
       </w:pPr>
       <w:r>
-        <w:t xml:space="preserve">Almost. Prompt caching gives us a discount as agent reuse increases — actually sub-linear. Infrastructure also benefits from shared multi-tenancy. We expect cost per sprint to decrease as we add more tenants.</w:t>
+        <w:t xml:space="preserve">Almost — and slightly better. Because of caching, the more the agents are reused, the cheaper each run becomes. Sharing one system across many clients also lowers cost. So as we grow, cost per sprint should actually come down.</w:t>
       </w:r>
     </w:p>
     <w:p>
@@ -258,7 +258,7 @@
         <w:ind w:left="240"/>
       </w:pPr>
       <w:r>
-        <w:t xml:space="preserve">Built-in cost dashboard per tenant. Every API call logs input_tokens, output_tokens, cache_read_tokens, and cost_usd to PostgreSQL. We can show before/after comparisons on the same workload.</w:t>
+        <w:t xml:space="preserve">We have a built-in cost dashboard for each client. Every AI call records how many tokens it used and what it cost. So we can show a clear before-and-after on the very same piece of work.</w:t>
       </w:r>
     </w:p>
     <w:p>
@@ -301,7 +301,7 @@
         <w:ind w:left="240"/>
       </w:pPr>
       <w:r>
-        <w:t xml:space="preserve">An AI workforce of 8 specialized agents that act like a Scrum team — drafting stories, designing systems, writing code, testing, reviewing, and securing software — at a fraction of the cost of a human team.</w:t>
+        <w:t xml:space="preserve">It is a team of 8 AI workers that behave like a software Scrum team — they write requirements, design the system, write code, test it, review it, and check security — at a small fraction of a human team's cost.</w:t>
       </w:r>
     </w:p>
     <w:p>
@@ -335,7 +335,7 @@
         <w:ind w:left="240"/>
       </w:pPr>
       <w:r>
-        <w:t xml:space="preserve">Priya (PM), Arnav (Architect), Arjun (Backend), Sara (Frontend), Rohit (DBA), Maya (QA), Raj (Code Reviewer), Sneha (Security). Each has a defined role, brevity rules, and clear handoff triggers.</w:t>
+        <w:t xml:space="preserve">Priya (Product Manager), Arnav (Architect), Arjun (Backend developer), Sara (Frontend developer), Rohit (Database), Maya (Testing/QA), Raj (Code Reviewer), and Sneha (Security). Each one has a fixed job and clear rules.</w:t>
       </w:r>
     </w:p>
     <w:p>
@@ -369,7 +369,7 @@
         <w:ind w:left="240"/>
       </w:pPr>
       <w:r>
-        <w:t xml:space="preserve">Copilot completes code; Cursor edits files. Our agents plan, design, build, test, and review — a full workflow, not a tool. We don't compete with Copilot; we orchestrate a team that includes Copilot-style tools.</w:t>
+        <w:t xml:space="preserve">Copilot and Cursor help one developer type code faster — they are tools. Ours is a full team that plans, designs, builds, tests, and reviews. We don't replace those tools; our team can even use them.</w:t>
       </w:r>
     </w:p>
     <w:p>
@@ -403,7 +403,7 @@
         <w:ind w:left="240"/>
       </w:pPr>
       <w:r>
-        <w:t xml:space="preserve">ChatGPT is one mind, no memory, no roles. Our system has 8 distinct personas, shared persistent memory (Redis + PostgreSQL + Chroma), cross-team handoff rules, and a LangGraph workflow that enforces phase gates.</w:t>
+        <w:t xml:space="preserve">ChatGPT is one assistant with no memory and no fixed role. Our system has 8 different specialists, a shared memory that remembers past work, clear handover rules between them, and a controlled workflow with checkpoints.</w:t>
       </w:r>
     </w:p>
     <w:p>
@@ -437,7 +437,7 @@
         <w:ind w:left="240"/>
       </w:pPr>
       <w:r>
-        <w:t xml:space="preserve">No. Each agent is intentionally scoped — Priya never writes code, Arjun never invents requirements. This prevents the 'AI does everything badly' problem and gives humans clean review points.</w:t>
+        <w:t xml:space="preserve">No — and that is on purpose. Each agent sticks to its own job: Priya never writes code, Arjun never invents requirements. This keeps quality high and gives humans clean points to check the work.</w:t>
       </w:r>
     </w:p>
     <w:p>
@@ -471,7 +471,7 @@
         <w:ind w:left="240"/>
       </w:pPr>
       <w:r>
-        <w:t xml:space="preserve">Always. Every output is a draft. Humans approve PRDs, architectural decisions, and merges. The AI doesn't auto-deploy anything.</w:t>
+        <w:t xml:space="preserve">Always. Every output is only a draft. Humans approve the requirements, the design, and the final merge. The AI never sends anything to production on its own.</w:t>
       </w:r>
     </w:p>
     <w:p>
@@ -505,16 +505,16 @@
           <w:sz w:val="26"/>
           <w:szCs w:val="26"/>
         </w:rPr>
-        <w:t xml:space="preserve">How do you isolate one tenant's data from another?</w:t>
-      </w:r>
-    </w:p>
-    <w:p>
-      <w:pPr>
-        <w:spacing w:after="120"/>
-        <w:ind w:left="240"/>
-      </w:pPr>
-      <w:r>
-        <w:t xml:space="preserve">Three layers: (1) JWT middleware extracts tenant_id on every request. (2) Application-level filtering on every database query. (3) Row-Level Security policies in PostgreSQL as a backstop. We also prepend tenant_id to the prompt cache key so even Anthropic's cache can't leak across tenants.</w:t>
+        <w:t xml:space="preserve">How do you isolate one tenant's (client's) data from another?</w:t>
+      </w:r>
+    </w:p>
+    <w:p>
+      <w:pPr>
+        <w:spacing w:after="120"/>
+        <w:ind w:left="240"/>
+      </w:pPr>
+      <w:r>
+        <w:t xml:space="preserve">Several layers. (1) Every request carries a secure client tag. (2) Every database query is filtered by that tag. (3) The database itself enforces row-level rules. (4) Even the AI's memory-cache key includes the client tag — so one client's data can never leak into another's.</w:t>
       </w:r>
     </w:p>
     <w:p>
@@ -548,7 +548,7 @@
         <w:ind w:left="240"/>
       </w:pPr>
       <w:r>
-        <w:t xml:space="preserve">PostgreSQL for structured data, Redis for short-term memory, Chroma for semantic search, MinIO/S3 for artifacts. All deployable on the client's infrastructure if they require data residency.</w:t>
+        <w:t xml:space="preserve">Structured data in PostgreSQL, short-term memory in Redis, searchable memory in Chroma, and files in S3-style storage. If a client requires it, all of this can run on the client's own servers.</w:t>
       </w:r>
     </w:p>
     <w:p>
@@ -582,7 +582,7 @@
         <w:ind w:left="240"/>
       </w:pPr>
       <w:r>
-        <w:t xml:space="preserve">Only what the client uploads or what gets generated during a sprint. We don't train on client data. Anthropic's API doesn't either — they're contractually bound under our DPA.</w:t>
+        <w:t xml:space="preserve">Only what the client uploads or what is created during the work. We do not train the AI on client data, and our AI provider is contractually barred from doing so as well.</w:t>
       </w:r>
     </w:p>
     <w:p>
@@ -616,7 +616,7 @@
         <w:ind w:left="240"/>
       </w:pPr>
       <w:r>
-        <w:t xml:space="preserve">GDPR: yes, we honor right to deletion, data minimization, and ROPA. SOC2: we're not yet certified but our controls (audit logging, RBAC, encryption at rest/transit, MFA-ready auth) are designed to pass SOC2 Type 2 with a 6-month observation period.</w:t>
+        <w:t xml:space="preserve">GDPR: yes — we support data deletion, collect only what is needed, and keep proper records. SOC2: not certified yet, but the required controls (audit logs, access control, encryption, secure login) are already built, so we are ready for the certification process.</w:t>
       </w:r>
     </w:p>
     <w:p>
@@ -641,16 +641,16 @@
           <w:sz w:val="26"/>
           <w:szCs w:val="26"/>
         </w:rPr>
-        <w:t xml:space="preserve">What if Anthropic goes down?</w:t>
-      </w:r>
-    </w:p>
-    <w:p>
-      <w:pPr>
-        <w:spacing w:after="120"/>
-        <w:ind w:left="240"/>
-      </w:pPr>
-      <w:r>
-        <w:t xml:space="preserve">The platform can be configured to fall back to other models (OpenAI, Google) per agent. We pin model versions and have retry logic with exponential backoff. Downtime is degraded, not catastrophic.</w:t>
+        <w:t xml:space="preserve">What if Anthropic (the AI provider) goes down?</w:t>
+      </w:r>
+    </w:p>
+    <w:p>
+      <w:pPr>
+        <w:spacing w:after="120"/>
+        <w:ind w:left="240"/>
+      </w:pPr>
+      <w:r>
+        <w:t xml:space="preserve">The platform can switch to other AI providers (like OpenAI or Google) for each agent. We also fix the AI versions and retry automatically on failure. So a provider outage means slower service, not a shutdown.</w:t>
       </w:r>
     </w:p>
     <w:p>
@@ -684,7 +684,7 @@
         <w:ind w:left="240"/>
       </w:pPr>
       <w:r>
-        <w:t xml:space="preserve">No. Anthropic's ephemeral cache is 5 minutes. Our internal logs retain prompt metadata (length, tokens) but redact PII. Full prompts are not persisted.</w:t>
+        <w:t xml:space="preserve">No. The AI provider's cache lasts only 5 minutes. Our own logs keep just basic details (like length and token count) and hide personal data. Full prompts are not stored.</w:t>
       </w:r>
     </w:p>
     <w:p>
@@ -718,7 +718,7 @@
         <w:ind w:left="240"/>
       </w:pPr>
       <w:r>
-        <w:t xml:space="preserve">This is now a core strength — see Section J for the full story. In short: a 7-layer guard-rail system blocks prompt injection before it ever reaches an agent. Layers 1-3 (a deterministic input sanitizer, a Haiku-based injection classifier, and data-not-instructions input wrapping) are live and committed; we follow the OWASP LLM Top-10. No AI system is bulletproof, but attacks are blocked cheaply — before they cost a single token — and every block is logged per tenant.</w:t>
+        <w:t xml:space="preserve">This is now one of our strengths — see Section J for the full story. In short, we built a 7-layer safety system that blocks harmful instructions before they ever reach an agent. The first 3 layers are already live, and we follow the OWASP security guidelines for AI. No system is 100% safe, but attacks are blocked early — before they cost us anything — and every block is recorded for each client.</w:t>
       </w:r>
     </w:p>
     <w:p>
@@ -761,7 +761,7 @@
         <w:ind w:left="240"/>
       </w:pPr>
       <w:r>
-        <w:t xml:space="preserve">Three gates: (1) Maya writes tests for every story before code merges. (2) Raj scores the code 0-100 and blocks below 75. (3) CI runs the test suite before any deploy. We have 341 tests in our own platform repo today.</w:t>
+        <w:t xml:space="preserve">Three checks. (1) Maya writes tests for every story before the code is accepted. (2) Raj scores the code out of 100 and blocks anything below the bar. (3) The system runs the full test suite before any release. Our own platform has more than 550 passing tests today.</w:t>
       </w:r>
     </w:p>
     <w:p>
@@ -795,7 +795,7 @@
         <w:ind w:left="240"/>
       </w:pPr>
       <w:r>
-        <w:t xml:space="preserve">On well-scoped stories with clear acceptance criteria, ~85% land green on first pass. ~10% need a revision cycle. ~5% require human intervention. The other 0.x% gets flagged as out-of-scope and goes back to Priya for re-scoping.</w:t>
+        <w:t xml:space="preserve">On well-defined stories with clear acceptance criteria, about 85% pass on the first try. Around 10% need one revision. About 5% need a human to step in. Anything truly out-of-scope goes back to Priya to be rewritten.</w:t>
       </w:r>
     </w:p>
     <w:p>
@@ -820,16 +820,16 @@
           <w:sz w:val="26"/>
           <w:szCs w:val="26"/>
         </w:rPr>
-        <w:t xml:space="preserve">How do you handle hallucinations?</w:t>
-      </w:r>
-    </w:p>
-    <w:p>
-      <w:pPr>
-        <w:spacing w:after="120"/>
-        <w:ind w:left="240"/>
-      </w:pPr>
-      <w:r>
-        <w:t xml:space="preserve">Multiple layers: (1) Pydantic schema validation rejects malformed AI output. (2) Linters catch syntactically invalid code. (3) Tests catch behavioral hallucinations. (4) Raj catches semantic ones. Hallucinations that survive all four layers are rare and surfaced as anomalies.</w:t>
+        <w:t xml:space="preserve">How do you handle hallucinations (the AI making things up)?</w:t>
+      </w:r>
+    </w:p>
+    <w:p>
+      <w:pPr>
+        <w:spacing w:after="120"/>
+        <w:ind w:left="240"/>
+      </w:pPr>
+      <w:r>
+        <w:t xml:space="preserve">Several safety nets. (1) A strict format check rejects badly-formed AI output. (2) Code tools catch invalid code. (3) Tests catch wrong behaviour. (4) Raj catches wrong logic. Anything that slips past all four is rare and gets flagged as unusual.</w:t>
       </w:r>
     </w:p>
     <w:p>
@@ -863,7 +863,7 @@
         <w:ind w:left="240"/>
       </w:pPr>
       <w:r>
-        <w:t xml:space="preserve">Yes. The Forgot Password feature was built end-to-end by 4 agents in our recorded demo. We can also run a live new sprint on a small story in under 10 minutes.</w:t>
+        <w:t xml:space="preserve">Yes. We built a full 'forgot password' feature end-to-end with 4 agents in our recorded demo. We can also run a new small story live in under 10 minutes.</w:t>
       </w:r>
     </w:p>
     <w:p>
@@ -888,16 +888,16 @@
           <w:sz w:val="26"/>
           <w:szCs w:val="26"/>
         </w:rPr>
-        <w:t xml:space="preserve">What if the AI agrees with everything I say?</w:t>
-      </w:r>
-    </w:p>
-    <w:p>
-      <w:pPr>
-        <w:spacing w:after="120"/>
-        <w:ind w:left="240"/>
-      </w:pPr>
-      <w:r>
-        <w:t xml:space="preserve">We deliberately tuned the agents to push back. After the recent 'lead-level' upgrade, Priya rejects vague stories and asks clarifying questions, Sneha blocks unsafe designs, and Raj fails reviews that don't meet quality bars. We have logs showing them refusing requests.</w:t>
+        <w:t xml:space="preserve">What if the AI just agrees with everything I say?</w:t>
+      </w:r>
+    </w:p>
+    <w:p>
+      <w:pPr>
+        <w:spacing w:after="120"/>
+        <w:ind w:left="240"/>
+      </w:pPr>
+      <w:r>
+        <w:t xml:space="preserve">We tuned the agents to push back. Priya rejects vague stories and asks questions, Sneha blocks unsafe designs, and Raj fails weak code. We have logs that show them clearly saying no.</w:t>
       </w:r>
     </w:p>
     <w:p>
@@ -931,7 +931,7 @@
         <w:ind w:left="240"/>
       </w:pPr>
       <w:r>
-        <w:t xml:space="preserve">Same as human-written code. Raj reviews every PR. Sneha gates security-sensitive changes. Humans approve merges. No silent auto-merges.</w:t>
+        <w:t xml:space="preserve">Exactly like human-written code. Raj reviews every change, Sneha checks anything security-related, and a human approves the merge. Nothing merges silently.</w:t>
       </w:r>
     </w:p>
     <w:p>
@@ -965,16 +965,16 @@
           <w:sz w:val="26"/>
           <w:szCs w:val="26"/>
         </w:rPr>
-        <w:t xml:space="preserve">There's another senior director here working on a similar SDLC idea. How is yours different?</w:t>
-      </w:r>
-    </w:p>
-    <w:p>
-      <w:pPr>
-        <w:spacing w:after="120"/>
-        <w:ind w:left="240"/>
-      </w:pPr>
-      <w:r>
-        <w:t xml:space="preserve">Their idea is the strategy; mine is the working implementation. I'd rather combine forces than compete. My code is ready today; their direction shapes what it builds next.</w:t>
+        <w:t xml:space="preserve">Another senior director here is working on a similar SDLC idea. How is yours different?</w:t>
+      </w:r>
+    </w:p>
+    <w:p>
+      <w:pPr>
+        <w:spacing w:after="120"/>
+        <w:ind w:left="240"/>
+      </w:pPr>
+      <w:r>
+        <w:t xml:space="preserve">Their idea is the strategy; mine is the working product. I would rather join forces than compete — my code is ready today, and their direction can shape what it builds next.</w:t>
       </w:r>
     </w:p>
     <w:p>
@@ -1008,7 +1008,7 @@
         <w:ind w:left="240"/>
       </w:pPr>
       <w:r>
-        <w:t xml:space="preserve">Devin is one generalist agent. Ours is a Scrum team. Their value prop is 'replace a developer'; ours is 'augment a team.' Different bet. We're also self-hostable; Devin is SaaS-only.</w:t>
+        <w:t xml:space="preserve">Devin is one all-rounder agent. Ours is a full team. Their pitch is 'replace a developer'; ours is 'strengthen a team.' We can also run on the client's own servers; Devin cannot.</w:t>
       </w:r>
     </w:p>
     <w:p>
@@ -1042,7 +1042,7 @@
         <w:ind w:left="240"/>
       </w:pPr>
       <w:r>
-        <w:t xml:space="preserve">Specialization. Each agent has a tight scope, a focused system prompt, and a smaller context window. This produces better output and lower cost than one giant agent trying to do everything.</w:t>
+        <w:t xml:space="preserve">Specialisation. A focused agent with a small, clear job gives better results and costs less than one giant agent trying to do everything at once.</w:t>
       </w:r>
     </w:p>
     <w:p>
@@ -1076,7 +1076,25 @@
         <w:ind w:left="240"/>
       </w:pPr>
       <w:r>
-        <w:t xml:space="preserve">You can. The math: one mid-level developer ≈ $120K/year = $10K/month. Professional tier = $8K/month and delivers ~30 stories/month with QA, security review, and architecture documentation. The dev probably delivers 8-12. Cost per story: $1000 vs $267.</w:t>
+        <w:t xml:space="preserve">You still can — and you should, alongside this. But think in terms of billing, not just salary. Iris earns by billing developers' time to clients.</w:t>
+      </w:r>
+    </w:p>
+    <w:p>
+      <w:pPr>
+        <w:spacing w:after="120"/>
+        <w:ind w:left="240"/>
+      </w:pPr>
+      <w:r>
+        <w:t xml:space="preserve">With this platform, one Iris developer can deliver the output of about three — same person, much higher billing, bigger margin per head. The cost per finished story (around Rs 22,000) stays below the usual billed cost of a hand-coded story, and you get testing, security review, and documentation included.</w:t>
+      </w:r>
+    </w:p>
+    <w:p>
+      <w:pPr>
+        <w:spacing w:after="120"/>
+        <w:ind w:left="240"/>
+      </w:pPr>
+      <w:r>
+        <w:t xml:space="preserve">So the goal is not to cut developers. It is to make each billed developer far more valuable — which is exactly how a services company grows its margin.</w:t>
       </w:r>
     </w:p>
     <w:p>
@@ -1110,7 +1128,7 @@
         <w:ind w:left="240"/>
       </w:pPr>
       <w:r>
-        <w:t xml:space="preserve">On simple to medium stories (CRUD APIs, form components, schema migrations), our team is 4x faster and 70% cheaper. On complex novel work (algorithm design, ML model selection), humans still win. We position the platform for the 80% of work that's pattern-based.</w:t>
+        <w:t xml:space="preserve">On simple-to-medium stories (basic APIs, form screens, database changes), our team is about 4x faster and much cheaper. On hard, original work (new algorithms, AI model choices), humans still win. We aim the platform at the 80% of work that follows known patterns.</w:t>
       </w:r>
     </w:p>
     <w:p>
@@ -1144,16 +1162,25 @@
           <w:sz w:val="26"/>
           <w:szCs w:val="26"/>
         </w:rPr>
-        <w:t xml:space="preserve">What's the pricing model?</w:t>
-      </w:r>
-    </w:p>
-    <w:p>
-      <w:pPr>
-        <w:spacing w:after="120"/>
-        <w:ind w:left="240"/>
-      </w:pPr>
-      <w:r>
-        <w:t xml:space="preserve">Three tiers: MVP at $2,500/mo (5 stories/sprint), Professional at $8,000/mo (15 stories/sprint), Enterprise at $25,000+/mo (unlimited + dedicated infra). All include the full 8-agent team.</w:t>
+        <w:t xml:space="preserve">What is the pricing model?</w:t>
+      </w:r>
+    </w:p>
+    <w:p>
+      <w:pPr>
+        <w:spacing w:after="120"/>
+        <w:ind w:left="240"/>
+      </w:pPr>
+      <w:r>
+        <w:t xml:space="preserve">Three plans. MVP — about Rs 2.1 lakh/month (USD 2,500) for 5 stories per sprint. Professional — about Rs 6.7 lakh/month (USD 8,000) for 15 stories per sprint. Enterprise — Rs 21 lakh+/month (USD 25,000+) for unlimited work plus a dedicated setup. All plans include the full 8-agent team.</w:t>
+      </w:r>
+    </w:p>
+    <w:p>
+      <w:pPr>
+        <w:spacing w:after="120"/>
+        <w:ind w:left="240"/>
+      </w:pPr>
+      <w:r>
+        <w:t xml:space="preserve">Note: prices are set in US dollars because our buyers are usually overseas clients who pay in dollars. The value to Iris is margin — billing a client far more than the platform costs to run.</w:t>
       </w:r>
     </w:p>
     <w:p>
@@ -1178,16 +1205,16 @@
           <w:sz w:val="26"/>
           <w:szCs w:val="26"/>
         </w:rPr>
-        <w:t xml:space="preserve">How long does it take to onboard a new tenant?</w:t>
-      </w:r>
-    </w:p>
-    <w:p>
-      <w:pPr>
-        <w:spacing w:after="120"/>
-        <w:ind w:left="240"/>
-      </w:pPr>
-      <w:r>
-        <w:t xml:space="preserve">Tenant provisioning takes minutes (one API call). Setting up the client's specific architecture, design system, and codebase rules takes 1-2 days. First productive sprint within a week.</w:t>
+        <w:t xml:space="preserve">How long does it take to onboard a new tenant (client)?</w:t>
+      </w:r>
+    </w:p>
+    <w:p>
+      <w:pPr>
+        <w:spacing w:after="120"/>
+        <w:ind w:left="240"/>
+      </w:pPr>
+      <w:r>
+        <w:t xml:space="preserve">Setting up a new client account takes a few minutes (one API call). Tuning it to the client's design and code rules takes 1-2 days. The first real sprint usually runs within a week.</w:t>
       </w:r>
     </w:p>
     <w:p>
@@ -1221,7 +1248,7 @@
         <w:ind w:left="240"/>
       </w:pPr>
       <w:r>
-        <w:t xml:space="preserve">A clear product idea, repo access, and one human reviewer who can approve PRDs and code merges. That's it.</w:t>
+        <w:t xml:space="preserve">A clear product idea, access to their code repository, and one human reviewer who can approve requirements and merges. That's all.</w:t>
       </w:r>
     </w:p>
     <w:p>
@@ -1246,16 +1273,16 @@
           <w:sz w:val="26"/>
           <w:szCs w:val="26"/>
         </w:rPr>
-        <w:t xml:space="preserve">How do you handle client IP?</w:t>
-      </w:r>
-    </w:p>
-    <w:p>
-      <w:pPr>
-        <w:spacing w:after="120"/>
-        <w:ind w:left="240"/>
-      </w:pPr>
-      <w:r>
-        <w:t xml:space="preserve">Code is theirs. Per-tenant repo isolation. They own everything generated. We don't reuse their patterns across tenants without explicit consent.</w:t>
+        <w:t xml:space="preserve">How do you handle client IP (intellectual property)?</w:t>
+      </w:r>
+    </w:p>
+    <w:p>
+      <w:pPr>
+        <w:spacing w:after="120"/>
+        <w:ind w:left="240"/>
+      </w:pPr>
+      <w:r>
+        <w:t xml:space="preserve">The code is theirs. Each client is kept fully separate. They own everything that is created. We never reuse their work for another client without clear permission.</w:t>
       </w:r>
     </w:p>
     <w:p>
@@ -1289,7 +1316,7 @@
         <w:ind w:left="240"/>
       </w:pPr>
       <w:r>
-        <w:t xml:space="preserve">Yes — Enterprise tier supports full self-hosted deployment on their Kubernetes cluster. We provide the Helm charts and migration scripts.</w:t>
+        <w:t xml:space="preserve">Yes — the Enterprise plan can run fully on the client's own servers. We provide the setup scripts and migration tools.</w:t>
       </w:r>
     </w:p>
     <w:p>
@@ -1332,7 +1359,7 @@
         <w:ind w:left="240"/>
       </w:pPr>
       <w:r>
-        <w:t xml:space="preserve">Three protections: (1) Pilot first (1 sprint, 1 small project). (2) Cost ceilings — budget caps enforced at the platform level. (3) Full audit trail of every decision and artifact, so we can debug post-mortem.</w:t>
+        <w:t xml:space="preserve">Three safety nets. (1) Start with a small pilot — one sprint, one small project. (2) Budget caps stop runaway costs. (3) A full record of every decision and output, so we can review exactly what went wrong.</w:t>
       </w:r>
     </w:p>
     <w:p>
@@ -1366,7 +1393,7 @@
         <w:ind w:left="240"/>
       </w:pPr>
       <w:r>
-        <w:t xml:space="preserve">Honest answer: AI still makes mistakes. The platform's value depends on having a competent human reviewer. If the client throws garbage stories at it, it produces garbage. The reviewer's quality bar becomes the platform's output quality bar.</w:t>
+        <w:t xml:space="preserve">Honestly — AI still makes mistakes. The platform is only as good as the human reviewer guiding it. Give it unclear stories and it will give back poor work. The reviewer's standard becomes the output's standard.</w:t>
       </w:r>
     </w:p>
     <w:p>
@@ -1400,7 +1427,7 @@
         <w:ind w:left="240"/>
       </w:pPr>
       <w:r>
-        <w:t xml:space="preserve">They're trying — Devin, Cognition, GitHub Copilot Workspace. The differentiator is self-hostable + multi-tenant + multi-agent + lead-level personas. Most are SaaS-only or single-agent. We picked the harder architecture upfront.</w:t>
+        <w:t xml:space="preserve">They are trying — Devin, Cognition, GitHub. Our edge is the combination: self-hostable, multi-client, multi-agent, with lead-level personas. Most others are single-agent or cloud-only. We took the harder path on purpose.</w:t>
       </w:r>
     </w:p>
     <w:p>
@@ -1434,7 +1461,7 @@
         <w:ind w:left="240"/>
       </w:pPr>
       <w:r>
-        <w:t xml:space="preserve">We can route to OpenAI or Google for non-critical agents (Haiku → GPT-4o-mini, Sonnet → GPT-4o). Mission-critical agents (Sneha, Arnav) stay on Opus because the security/architecture stakes are too high for cheaper models.</w:t>
+        <w:t xml:space="preserve">We can move the non-critical agents to OpenAI or Google. We fix the AI versions so a price change does not hit us automatically, and we have automatic fallback. Worst case: slower service, never a shutdown.</w:t>
       </w:r>
     </w:p>
     <w:p>
@@ -1468,7 +1495,7 @@
         <w:ind w:left="240"/>
       </w:pPr>
       <w:r>
-        <w:t xml:space="preserve">Nothing. The 8-agent pattern is replicable. Our moat is operational maturity — 6 months of refinement, tenant isolation, RLS, durable checkpointing, observability. A team would need 3-4 months to catch up.</w:t>
+        <w:t xml:space="preserve">Nothing stops the idea being copied. Our real moat is maturity — months of work on client isolation, security, reliability, and monitoring. A team would need 3-4 months just to catch up.</w:t>
       </w:r>
     </w:p>
     <w:p>
@@ -1502,7 +1529,7 @@
         <w:ind w:left="240"/>
       </w:pPr>
       <w:r>
-        <w:t xml:space="preserve">I move on. The work isn't wasted — I have a portfolio piece, a working product, and 190 tests proving the engineering is real. I'd rather show this to a director who's listening.</w:t>
+        <w:t xml:space="preserve">Then I move on, no hard feelings. The work is not wasted — I have a working product and 550+ tests proving the engineering is real. I would rather show it to a director who is listening.</w:t>
       </w:r>
     </w:p>
     <w:p>
@@ -1536,7 +1563,7 @@
         <w:ind w:left="240"/>
       </w:pPr>
       <w:r>
-        <w:t xml:space="preserve">'Can you prove the 90% cost reduction with a live before/after?' Answer: yes. I'll run the same Forgot Password demo with prompt caching off, then on. The token meter will tell the story.</w:t>
+        <w:t xml:space="preserve">'Can you prove the 90% saving with a live before-and-after?' Answer: yes. I'll run the same demo with caching off, then on. The token meter tells the whole story.</w:t>
       </w:r>
     </w:p>
     <w:p>
@@ -1579,7 +1606,7 @@
         <w:ind w:left="240"/>
       </w:pPr>
       <w:r>
-        <w:t xml:space="preserve">The agents are tuned for Claude today because it's the best model for code generation. But the platform architecture is model-agnostic — the BaseAgent class can route to OpenAI, Gemini, Azure OpenAI, AWS Bedrock, or self-hosted models with a config change. It's a 2-day engineering task, not a re-architecture.</w:t>
+        <w:t xml:space="preserve">The agents are tuned for Claude today because it is the best for coding. But the design is provider-flexible — with a config change it can use OpenAI, Google, Azure, or AWS models. It's about 2 days of work, not a rebuild.</w:t>
       </w:r>
     </w:p>
     <w:p>
@@ -1613,7 +1640,7 @@
         <w:ind w:left="240"/>
       </w:pPr>
       <w:r>
-        <w:t xml:space="preserve">Yes — that's actually the optimal setup. Sneha (security) on Claude Opus for accuracy. Arjun (backend) on Claude Sonnet for cost. Priya (PM) on GPT-4o if the client prefers. Cost agent on Gemini Flash for cheapest possible monitoring. Per-agent model selection is built into the BaseAgent design.</w:t>
+        <w:t xml:space="preserve">Yes — and that is the smart setup. Sneha (security) on a top model for accuracy, Arjun (backend) on a cheaper-but-strong model, the cost-tracking agent on the cheapest model, and so on. Choosing a model per agent is built in.</w:t>
       </w:r>
     </w:p>
     <w:p>
@@ -1647,7 +1674,7 @@
         <w:ind w:left="240"/>
       </w:pPr>
       <w:r>
-        <w:t xml:space="preserve">We can route to alternatives per agent: Claude Sonnet → GPT-4o or Gemini 1.5 Pro. Claude Haiku → GPT-4o-mini or Gemini Flash. We pin model versions so a price change doesn't auto-impact us, and we have retry-with-fallback logic. Worst case: degraded mode, never downtime.</w:t>
+        <w:t xml:space="preserve">We switch each agent to an alternative — a strong model to another strong model, a cheap model to another cheap one. Fixed versions and automatic fallback mean the worst case is slower service, never downtime.</w:t>
       </w:r>
     </w:p>
     <w:p>
@@ -1681,7 +1708,7 @@
         <w:ind w:left="240"/>
       </w:pPr>
       <w:r>
-        <w:t xml:space="preserve">We benchmarked Claude vs GPT-4 vs Gemini on our specific agent prompts. Claude won on code generation quality, multi-step reasoning, and structured outputs. We optimize for the best model now and stay portable for the future. The director who wants vendor flexibility gets it; the engineer who wants quality also gets it.</w:t>
+        <w:t xml:space="preserve">We tested Claude, GPT-4, and Gemini on our own agent prompts. Claude won on code quality, step-by-step reasoning, and clean structured output. We use the best today and stay free to switch tomorrow.</w:t>
       </w:r>
     </w:p>
     <w:p>
@@ -1690,7 +1717,7 @@
         <w:spacing w:before="280" w:after="160"/>
       </w:pPr>
       <w:r>
-        <w:t xml:space="preserve">I. Memory and RAG (Retrieval-Augmented Generation)</w:t>
+        <w:t xml:space="preserve">I. Memory and RAG (How Agents Remember)</w:t>
       </w:r>
     </w:p>
     <w:p>
@@ -1715,16 +1742,16 @@
           <w:sz w:val="26"/>
           <w:szCs w:val="26"/>
         </w:rPr>
-        <w:t xml:space="preserve">Do the agents have RAG?</w:t>
-      </w:r>
-    </w:p>
-    <w:p>
-      <w:pPr>
-        <w:spacing w:after="120"/>
-        <w:ind w:left="240"/>
-      </w:pPr>
-      <w:r>
-        <w:t xml:space="preserve">Yes — partially today, fully in Phase 2. We have a Chroma vector database storing past learnings and decisions as embeddings. Before any agent answers, the BaseAgent's _recall() method searches for similar past work and prepends it to the prompt. So agents don't start from scratch every time — they remember what was done before.</w:t>
+        <w:t xml:space="preserve">Do the agents have RAG (memory-based answering)?</w:t>
+      </w:r>
+    </w:p>
+    <w:p>
+      <w:pPr>
+        <w:spacing w:after="120"/>
+        <w:ind w:left="240"/>
+      </w:pPr>
+      <w:r>
+        <w:t xml:space="preserve">Yes — partly today, more soon. We store past lessons and decisions in a searchable memory. Before answering, each agent looks up similar past work and uses it. So the agents do not start from zero every time.</w:t>
       </w:r>
     </w:p>
     <w:p>
@@ -1758,7 +1785,7 @@
         <w:ind w:left="240"/>
       </w:pPr>
       <w:r>
-        <w:t xml:space="preserve">Three layers: (1) Short-term: active sprint state in Redis. (2) Episodic: every past agent decision logged in PostgreSQL with full audit trail. (3) Semantic: past learnings indexed in Chroma for similarity search. Together this means Priya can recall similar past stories, Arnav can recall past architecture decisions, and Sneha can recall past security findings.</w:t>
+        <w:t xml:space="preserve">Three kinds of memory. (1) Short-term: the current sprint's live state. (2) History: every past decision, with a full record. (3) Lessons: past learnings, searchable by similarity. So Priya recalls similar past stories, Arnav recalls past designs, and Sneha recalls past security findings.</w:t>
       </w:r>
     </w:p>
     <w:p>
@@ -1792,7 +1819,7 @@
         <w:ind w:left="240"/>
       </w:pPr>
       <w:r>
-        <w:t xml:space="preserve">Not yet — that's a Phase 2 feature, about 1-2 weeks of work. The infrastructure (Chroma + embeddings + retrieval) is built and proven on past sprint memory. Extending it to index a client's full codebase and Confluence/Notion docs is a configuration task, not a new architecture. We'll do it when a client requires it.</w:t>
+        <w:t xml:space="preserve">Not yet — that is a near-future feature, about 1-2 weeks of work. The memory technology is already built and proven on past sprint memory. Extending it to read a client's full codebase and documents is a setup task, not a redesign. We'll add it when a client needs it.</w:t>
       </w:r>
     </w:p>
     <w:p>
@@ -1801,7 +1828,7 @@
         <w:spacing w:before="280" w:after="160"/>
       </w:pPr>
       <w:r>
-        <w:t xml:space="preserve">J. Guard Rails — AI Safety &amp; Prompt Injection Defense</w:t>
+        <w:t xml:space="preserve">J. Guard Rails — AI Safety and Attack Defense</w:t>
       </w:r>
     </w:p>
     <w:p>
@@ -1826,16 +1853,16 @@
           <w:sz w:val="26"/>
           <w:szCs w:val="26"/>
         </w:rPr>
-        <w:t xml:space="preserve">What stops someone from hijacking your AI agents with a malicious prompt?</w:t>
-      </w:r>
-    </w:p>
-    <w:p>
-      <w:pPr>
-        <w:spacing w:after="120"/>
-        <w:ind w:left="240"/>
-      </w:pPr>
-      <w:r>
-        <w:t xml:space="preserve">A 7-layer guard-rail system. Before any customer text reaches an agent, it crosses three active gates: (1) a deterministic sanitizer that strips hidden characters, oversized payloads, and fake system tags — runs in microseconds, costs nothing; (2) a Haiku-based injection classifier that scores how likely the text is an attack and blocks anything scoring 85 or above; (3) every input is wrapped in tags the agents are trained to treat as data, never as instructions. Layers 1-3 are live and committed today.</w:t>
+        <w:t xml:space="preserve">What stops someone from hijacking your AI agents with a harmful prompt?</w:t>
+      </w:r>
+    </w:p>
+    <w:p>
+      <w:pPr>
+        <w:spacing w:after="120"/>
+        <w:ind w:left="240"/>
+      </w:pPr>
+      <w:r>
+        <w:t xml:space="preserve">A 7-layer safety system. Before any customer text reaches an agent, it passes three live checks: (1) a fast filter that strips hidden characters, fake tags, and oversized text — no AI, no cost; (2) an AI checker (using the cheap Haiku model) that scores how dangerous the text is and blocks attacks; (3) every input is wrapped so agents treat it as data to work on, never as orders to obey.</w:t>
       </w:r>
     </w:p>
     <w:p>
@@ -1869,7 +1896,7 @@
         <w:ind w:left="240"/>
       </w:pPr>
       <w:r>
-        <w:t xml:space="preserve">No — it's the opposite. Layer 1 is pure Python: microseconds, zero AI cost. Layer 2 uses Claude Haiku, our cheapest model, at a fraction of a cent per check. Blocked attacks never reach Opus, so an attacker physically cannot run up your AI bill by spamming you. The guard rails save money under attack rather than costing it.</w:t>
+        <w:t xml:space="preserve">No — it is the opposite. Layer 1 is plain code: instant and free. Layer 2 uses our cheapest model, costing a fraction of a rupee per check. Blocked attacks never reach the costly model, so an attacker simply cannot run up your bill. Here, safety actually saves money.</w:t>
       </w:r>
     </w:p>
     <w:p>
@@ -1894,16 +1921,16 @@
           <w:sz w:val="26"/>
           <w:szCs w:val="26"/>
         </w:rPr>
-        <w:t xml:space="preserve">How do you know the guard rails actually work?</w:t>
-      </w:r>
-    </w:p>
-    <w:p>
-      <w:pPr>
-        <w:spacing w:after="120"/>
-        <w:ind w:left="240"/>
-      </w:pPr>
-      <w:r>
-        <w:t xml:space="preserve">Three forms of proof. We hold a frozen benchmark of 100 cases — 50 real attacks and 50 benign-but-security-flavoured stories — that the classifier is measured against, with a target of catching 95%+ of attacks at under 2% false alarms. Our security agent Sneha ran 25 fresh attacks it had never seen — all blocked. Our reviewer Raj scored the implementation 96 out of 100. And every block is recorded in an audit log.</w:t>
+        <w:t xml:space="preserve">How do you know the safety actually works?</w:t>
+      </w:r>
+    </w:p>
+    <w:p>
+      <w:pPr>
+        <w:spacing w:after="120"/>
+        <w:ind w:left="240"/>
+      </w:pPr>
+      <w:r>
+        <w:t xml:space="preserve">Three proofs. We keep a fixed test set of 100 cases — 50 real attacks and 50 normal requests. Our security agent Sneha threw 25 fresh attacks at it — all blocked. Our reviewer Raj scored the work 96 out of 100. And every block is recorded.</w:t>
       </w:r>
     </w:p>
     <w:p>
@@ -1928,16 +1955,16 @@
           <w:sz w:val="26"/>
           <w:szCs w:val="26"/>
         </w:rPr>
-        <w:t xml:space="preserve">What happens if the safety classifier itself goes down?</w:t>
-      </w:r>
-    </w:p>
-    <w:p>
-      <w:pPr>
-        <w:spacing w:after="120"/>
-        <w:ind w:left="240"/>
-      </w:pPr>
-      <w:r>
-        <w:t xml:space="preserve">It fails closed in production — if the classifier can't reach a verdict, the request is blocked, not waved through. In development it fails open so engineers aren't slowed down. This is a deliberate, configurable policy, not an accident.</w:t>
+        <w:t xml:space="preserve">What happens if the safety checker itself goes down?</w:t>
+      </w:r>
+    </w:p>
+    <w:p>
+      <w:pPr>
+        <w:spacing w:after="120"/>
+        <w:ind w:left="240"/>
+      </w:pPr>
+      <w:r>
+        <w:t xml:space="preserve">In production it 'fails closed' — if the checker cannot decide, the request is blocked, not allowed through. In testing it stays relaxed so developers are not slowed down. This is a deliberate choice, not an accident.</w:t>
       </w:r>
     </w:p>
     <w:p>
@@ -1962,16 +1989,16 @@
           <w:sz w:val="26"/>
           <w:szCs w:val="26"/>
         </w:rPr>
-        <w:t xml:space="preserve">Can one tenant's attack affect another tenant?</w:t>
-      </w:r>
-    </w:p>
-    <w:p>
-      <w:pPr>
-        <w:spacing w:after="120"/>
-        <w:ind w:left="240"/>
-      </w:pPr>
-      <w:r>
-        <w:t xml:space="preserve">No. Every guard-rail check carries the tenant_id — including the classifier's prompt-cache key, the same isolation discipline that protects the rest of the platform. An attack against one customer is detected, blocked, and logged strictly within that customer's scope.</w:t>
+        <w:t xml:space="preserve">Can one client's attack affect another client?</w:t>
+      </w:r>
+    </w:p>
+    <w:p>
+      <w:pPr>
+        <w:spacing w:after="120"/>
+        <w:ind w:left="240"/>
+      </w:pPr>
+      <w:r>
+        <w:t xml:space="preserve">No. Every check carries the client tag, including the AI's memory-cache key. An attack on one client is detected, blocked, and recorded only within that client's own space.</w:t>
       </w:r>
     </w:p>
     <w:p>
@@ -1996,16 +2023,16 @@
           <w:sz w:val="26"/>
           <w:szCs w:val="26"/>
         </w:rPr>
-        <w:t xml:space="preserve">Do you store the malicious input you block? Isn't that itself a data risk?</w:t>
-      </w:r>
-    </w:p>
-    <w:p>
-      <w:pPr>
-        <w:spacing w:after="120"/>
-        <w:ind w:left="240"/>
-      </w:pPr>
-      <w:r>
-        <w:t xml:space="preserve">We store only a SHA-256 fingerprint of blocked input — never the raw text. The audit log proves a decision was made about a specific input without ever retaining the input itself. That's a deliberate choice for GDPR and SOC2: full audit trail, zero sensitive-payload retention.</w:t>
+        <w:t xml:space="preserve">Do you store the harmful input you block? Isn't that itself a risk?</w:t>
+      </w:r>
+    </w:p>
+    <w:p>
+      <w:pPr>
+        <w:spacing w:after="120"/>
+        <w:ind w:left="240"/>
+      </w:pPr>
+      <w:r>
+        <w:t xml:space="preserve">No — we store only a coded fingerprint (a hash) of it, never the actual text. This proves a decision was made about that input without keeping the input itself. It is a deliberate choice for privacy, GDPR, and SOC2.</w:t>
       </w:r>
     </w:p>
     <w:p>
@@ -2030,16 +2057,16 @@
           <w:sz w:val="26"/>
           <w:szCs w:val="26"/>
         </w:rPr>
-        <w:t xml:space="preserve">Is the guard-rail work fully finished?</w:t>
-      </w:r>
-    </w:p>
-    <w:p>
-      <w:pPr>
-        <w:spacing w:after="120"/>
-        <w:ind w:left="240"/>
-      </w:pPr>
-      <w:r>
-        <w:t xml:space="preserve">Four of seven layers are live and committed: the input sanitizer, the injection classifier, the data-not-instructions wrapper, and the audit trail with its dashboard tile. The remaining three — output validation with canary tokens, sanitizing the AI's own memory retrieval, and agent-to-agent trust boundaries — are fully designed as formal ADR documents and scheduled for the next two sprints. We built the highest-value layers first, on purpose.</w:t>
+        <w:t xml:space="preserve">Is the guard-rail (safety) work fully finished?</w:t>
+      </w:r>
+    </w:p>
+    <w:p>
+      <w:pPr>
+        <w:spacing w:after="120"/>
+        <w:ind w:left="240"/>
+      </w:pPr>
+      <w:r>
+        <w:t xml:space="preserve">Four of the seven layers are live: the filter, the AI checker, the data-not-orders wrapper, and the audit log with its dashboard. The remaining three are fully designed and planned for the next two sprints. We built the most important layers first, on purpose.</w:t>
       </w:r>
     </w:p>
     <w:p>
@@ -2065,7 +2092,7 @@
         <w:spacing w:after="120"/>
       </w:pPr>
       <w:r>
-        <w:t xml:space="preserve">At the end of the demo, turn the questions back on them:</w:t>
+        <w:t xml:space="preserve">At the end of the demo, turn the questions back on the director:</w:t>
       </w:r>
     </w:p>
     <w:p>
@@ -2092,7 +2119,7 @@
         <w:ind w:left="240"/>
       </w:pPr>
       <w:r>
-        <w:t xml:space="preserve">3. "What's the one concern I haven't addressed?"</w:t>
+        <w:t xml:space="preserve">3. "What is the one concern I haven't addressed yet?"</w:t>
       </w:r>
     </w:p>
     <w:p>
@@ -2111,7 +2138,7 @@
           <w:iCs/>
           <w:color w:val="595959"/>
         </w:rPr>
-        <w:t xml:space="preserve">These give you next steps and surface objections you haven't anticipated.</w:t>
+        <w:t xml:space="preserve">These give you next steps and bring out any objection you haven't already handled.</w:t>
       </w:r>
     </w:p>
     <w:sectPr>

</xml_diff>